<commit_message>
bug fix & fast review
</commit_message>
<xml_diff>
--- a/docs/chat_bot.docx
+++ b/docs/chat_bot.docx
@@ -32,7 +32,15 @@
         <w:ind w:left="1440"/>
       </w:pPr>
       <w:r>
-        <w:t xml:space="preserve">Необходимо разработать программу которая на естественном языке взаимодействует с пользователем и выполняет один из заданных сценариев (вызов необходимой прогностической модели, ответ пользователю). </w:t>
+        <w:t xml:space="preserve">Необходимо разработать </w:t>
+      </w:r>
+      <w:proofErr w:type="gramStart"/>
+      <w:r>
+        <w:t>программу</w:t>
+      </w:r>
+      <w:proofErr w:type="gramEnd"/>
+      <w:r>
+        <w:t xml:space="preserve"> которая на естественном языке взаимодействует с пользователем и выполняет один из заданных сценариев (вызов необходимой прогностической модели, ответ пользователю). </w:t>
       </w:r>
     </w:p>
     <w:p>
@@ -124,9 +132,11 @@
           <w:numId w:val="3"/>
         </w:numPr>
       </w:pPr>
+      <w:proofErr w:type="spellStart"/>
       <w:r>
         <w:t>Антицели</w:t>
       </w:r>
+      <w:proofErr w:type="spellEnd"/>
     </w:p>
     <w:p>
       <w:pPr>
@@ -236,7 +246,15 @@
         <w:ind w:left="1416"/>
       </w:pPr>
       <w:r>
-        <w:t>- чат бот не сможет понять о каком ряде говорит пользователь или для тех вопросов где пользователь не указывает ряд, чат-бот всё равно будет находить какой-то ряд</w:t>
+        <w:t xml:space="preserve">- чат бот не сможет понять о каком ряде говорит пользователь или для тех </w:t>
+      </w:r>
+      <w:proofErr w:type="gramStart"/>
+      <w:r>
+        <w:t>вопросов</w:t>
+      </w:r>
+      <w:proofErr w:type="gramEnd"/>
+      <w:r>
+        <w:t xml:space="preserve"> где пользователь не указывает ряд, чат-бот всё равно будет находить какой-то ряд</w:t>
       </w:r>
     </w:p>
     <w:p>
@@ -288,7 +306,31 @@
         <w:ind w:left="1416"/>
       </w:pPr>
       <w:r>
-        <w:t>- Что делать если пользователь задал несколько вопросов в одном? Например, оцени как изменятся продажи и поездки через неделю.</w:t>
+        <w:t xml:space="preserve">- Что делать если пользователь задал несколько вопросов в одном? Например, </w:t>
+      </w:r>
+      <w:proofErr w:type="gramStart"/>
+      <w:r>
+        <w:t>оцени</w:t>
+      </w:r>
+      <w:proofErr w:type="gramEnd"/>
+      <w:r>
+        <w:t xml:space="preserve"> как изменятся продажи и поездки через неделю.</w:t>
+      </w:r>
+    </w:p>
+    <w:p>
+      <w:pPr>
+        <w:ind w:left="1416"/>
+      </w:pPr>
+      <w:r>
+        <w:t xml:space="preserve">- Что делать, если боту задают вопрос не по </w:t>
+      </w:r>
+      <w:proofErr w:type="gramStart"/>
+      <w:r>
+        <w:t>теме</w:t>
+      </w:r>
+      <w:proofErr w:type="gramEnd"/>
+      <w:r>
+        <w:t xml:space="preserve"> но с ключевыми словами? Сколько стоит поездка в Дубай на следующей неделе?</w:t>
       </w:r>
     </w:p>
     <w:p/>
@@ -333,7 +375,16 @@
         <w:ind w:left="720"/>
       </w:pPr>
       <w:r>
-        <w:t xml:space="preserve">Предлагается разработать жесткий пайплайн для работы с вопросом пользователя с использованием </w:t>
+        <w:lastRenderedPageBreak/>
+        <w:t xml:space="preserve">Предлагается разработать жесткий </w:t>
+      </w:r>
+      <w:proofErr w:type="spellStart"/>
+      <w:r>
+        <w:t>пайплайн</w:t>
+      </w:r>
+      <w:proofErr w:type="spellEnd"/>
+      <w:r>
+        <w:t xml:space="preserve"> для работы с вопросом пользователя с использованием </w:t>
       </w:r>
       <w:r>
         <w:rPr>
@@ -353,9 +404,13 @@
         </w:rPr>
       </w:pPr>
       <w:r>
-        <w:lastRenderedPageBreak/>
-        <w:t>Этапы пайплайны</w:t>
-      </w:r>
+        <w:t xml:space="preserve">Этапы </w:t>
+      </w:r>
+      <w:proofErr w:type="spellStart"/>
+      <w:r>
+        <w:t>пайплайны</w:t>
+      </w:r>
+      <w:proofErr w:type="spellEnd"/>
       <w:r>
         <w:rPr>
           <w:lang w:val="en-US"/>
@@ -383,14 +438,27 @@
           <w:numId w:val="6"/>
         </w:numPr>
       </w:pPr>
-      <w:r>
-        <w:t>Распарсить из вопроса пользователя дату прогноза или вернуть ответ что информация по дате и длительности прогноза не найдена</w:t>
+      <w:proofErr w:type="spellStart"/>
+      <w:r>
+        <w:t>Распарсить</w:t>
+      </w:r>
+      <w:proofErr w:type="spellEnd"/>
+      <w:r>
+        <w:t xml:space="preserve"> из вопроса пользователя дату прогноза или вернуть ответ что информация по дате и длительности прогноза не найдена</w:t>
       </w:r>
       <w:r>
         <w:t xml:space="preserve">: </w:t>
       </w:r>
       <w:r>
-        <w:t xml:space="preserve">дата парсится в формате </w:t>
+        <w:t xml:space="preserve">дата </w:t>
+      </w:r>
+      <w:proofErr w:type="spellStart"/>
+      <w:r>
+        <w:t>парсится</w:t>
+      </w:r>
+      <w:proofErr w:type="spellEnd"/>
+      <w:r>
+        <w:t xml:space="preserve"> в формате </w:t>
       </w:r>
       <w:r>
         <w:rPr>
@@ -471,7 +539,15 @@
         <w:ind w:left="708"/>
       </w:pPr>
       <w:r>
-        <w:t xml:space="preserve">Данный пайплайн имеет уязвимость к вопросам, которые в себе содержат несколько атомарных вопросов. </w:t>
+        <w:t xml:space="preserve">Данный </w:t>
+      </w:r>
+      <w:proofErr w:type="spellStart"/>
+      <w:r>
+        <w:t>пайплайн</w:t>
+      </w:r>
+      <w:proofErr w:type="spellEnd"/>
+      <w:r>
+        <w:t xml:space="preserve"> имеет уязвимость к вопросам, которые в себе содержат несколько атомарных вопросов. </w:t>
       </w:r>
     </w:p>
     <w:p>
@@ -527,7 +603,15 @@
         <w:t>поскольку не указано относительно чего мы должны указывать текущую дату, будет использоваться дата и время сервера, на котором развернута система</w:t>
       </w:r>
       <w:r>
-        <w:t xml:space="preserve"> (В итоговом решении не используется, текущая дата передается в системный промпт агент)</w:t>
+        <w:t xml:space="preserve"> (В итоговом решении не используется, текущая дата передается в системный </w:t>
+      </w:r>
+      <w:proofErr w:type="spellStart"/>
+      <w:r>
+        <w:t>промпт</w:t>
+      </w:r>
+      <w:proofErr w:type="spellEnd"/>
+      <w:r>
+        <w:t xml:space="preserve"> агент)</w:t>
       </w:r>
     </w:p>
     <w:p>
@@ -553,7 +637,15 @@
         <w:t xml:space="preserve">: </w:t>
       </w:r>
       <w:r>
-        <w:t xml:space="preserve">отдельно оценивается каждый этап пайплайна, затем оценивается итоговый ответ, далее </w:t>
+        <w:t xml:space="preserve">отдельно оценивается каждый этап </w:t>
+      </w:r>
+      <w:proofErr w:type="spellStart"/>
+      <w:r>
+        <w:t>пайплайна</w:t>
+      </w:r>
+      <w:proofErr w:type="spellEnd"/>
+      <w:r>
+        <w:t xml:space="preserve">, затем оценивается итоговый ответ, далее </w:t>
       </w:r>
     </w:p>
     <w:p>
@@ -569,8 +661,13 @@
           <w:numId w:val="7"/>
         </w:numPr>
       </w:pPr>
-      <w:r>
-        <w:t>Парсинг типа задачи</w:t>
+      <w:proofErr w:type="spellStart"/>
+      <w:r>
+        <w:t>Парсинг</w:t>
+      </w:r>
+      <w:proofErr w:type="spellEnd"/>
+      <w:r>
+        <w:t xml:space="preserve"> типа задачи</w:t>
       </w:r>
       <w:r>
         <w:t xml:space="preserve">: </w:t>
@@ -590,12 +687,14 @@
       <w:r>
         <w:t xml:space="preserve">и </w:t>
       </w:r>
+      <w:proofErr w:type="spellStart"/>
       <w:r>
         <w:rPr>
           <w:lang w:val="en-US"/>
         </w:rPr>
         <w:t>specifity</w:t>
       </w:r>
+      <w:proofErr w:type="spellEnd"/>
     </w:p>
     <w:p>
       <w:pPr>
@@ -605,8 +704,13 @@
           <w:numId w:val="7"/>
         </w:numPr>
       </w:pPr>
-      <w:r>
-        <w:t>Парсинг дат</w:t>
+      <w:proofErr w:type="spellStart"/>
+      <w:r>
+        <w:t>Парсинг</w:t>
+      </w:r>
+      <w:proofErr w:type="spellEnd"/>
+      <w:r>
+        <w:t xml:space="preserve"> дат</w:t>
       </w:r>
       <w:r>
         <w:t xml:space="preserve">: </w:t>
@@ -623,12 +727,14 @@
       <w:r>
         <w:t xml:space="preserve">и </w:t>
       </w:r>
+      <w:proofErr w:type="spellStart"/>
       <w:r>
         <w:rPr>
           <w:lang w:val="en-US"/>
         </w:rPr>
         <w:t>specifity</w:t>
       </w:r>
+      <w:proofErr w:type="spellEnd"/>
     </w:p>
     <w:p>
       <w:pPr>
@@ -645,13 +751,48 @@
         <w:t xml:space="preserve">: </w:t>
       </w:r>
       <w:r>
-        <w:t xml:space="preserve">важно чтобы агент ответил правильно на вопросы когда нужен прогноз по временным рядам. При этом мы не знаем цену ошибки если агент дал ложный прогноз когда его об этом не просили. Поэтому будем использовать </w:t>
+        <w:t xml:space="preserve">важно чтобы агент ответил правильно на </w:t>
+      </w:r>
+      <w:proofErr w:type="gramStart"/>
+      <w:r>
+        <w:t>вопросы</w:t>
+      </w:r>
+      <w:proofErr w:type="gramEnd"/>
+      <w:r>
+        <w:t xml:space="preserve"> когда нужен прогноз по временным рядам. При этом мы не знаем цену ошибки если агент дал ложный </w:t>
+      </w:r>
+      <w:proofErr w:type="gramStart"/>
+      <w:r>
+        <w:t>прогноз</w:t>
+      </w:r>
+      <w:proofErr w:type="gramEnd"/>
+      <w:r>
+        <w:t xml:space="preserve"> когда его об этом не просили. Поэтому будем использовать </w:t>
       </w:r>
       <w:r>
         <w:rPr>
           <w:lang w:val="en-US"/>
         </w:rPr>
         <w:t>accuracy</w:t>
+      </w:r>
+    </w:p>
+    <w:p/>
+    <w:p>
+      <w:r>
+        <w:t xml:space="preserve">Необходимо </w:t>
+      </w:r>
+      <w:proofErr w:type="gramStart"/>
+      <w:r>
+        <w:t>определить</w:t>
+      </w:r>
+      <w:proofErr w:type="gramEnd"/>
+      <w:r>
+        <w:t xml:space="preserve"> что означает «на следующей неделе», «в следующем месяце» и т.д. </w:t>
+      </w:r>
+    </w:p>
+    <w:p>
+      <w:r>
+        <w:t>Я делаю допущение, что имеется ввиду первый день недели / месяца и т.д.</w:t>
       </w:r>
     </w:p>
     <w:p>
@@ -682,7 +823,15 @@
         </w:rPr>
       </w:pPr>
       <w:r>
-        <w:t>Первая версия пайплайна, метрики</w:t>
+        <w:t xml:space="preserve">Первая версия </w:t>
+      </w:r>
+      <w:proofErr w:type="spellStart"/>
+      <w:r>
+        <w:t>пайплайна</w:t>
+      </w:r>
+      <w:proofErr w:type="spellEnd"/>
+      <w:r>
+        <w:t>, метрики</w:t>
       </w:r>
       <w:r>
         <w:rPr>
@@ -742,7 +891,6 @@
           <w:szCs w:val="24"/>
           <w:lang w:eastAsia="ru-RU"/>
         </w:rPr>
-        <w:lastRenderedPageBreak/>
         <w:t>Данные: </w:t>
       </w:r>
       <w:r>
@@ -777,7 +925,43 @@
           <w:szCs w:val="24"/>
           <w:lang w:eastAsia="ru-RU"/>
         </w:rPr>
-        <w:t>, сравнение с golden dataset.</w:t>
+        <w:t>, сравнение с </w:t>
+      </w:r>
+      <w:proofErr w:type="spellStart"/>
+      <w:r>
+        <w:rPr>
+          <w:rFonts w:eastAsia="Times New Roman" w:cs="Times New Roman"/>
+          <w:szCs w:val="24"/>
+          <w:lang w:eastAsia="ru-RU"/>
+        </w:rPr>
+        <w:t>golden</w:t>
+      </w:r>
+      <w:proofErr w:type="spellEnd"/>
+      <w:r>
+        <w:rPr>
+          <w:rFonts w:eastAsia="Times New Roman" w:cs="Times New Roman"/>
+          <w:szCs w:val="24"/>
+          <w:lang w:eastAsia="ru-RU"/>
+        </w:rPr>
+        <w:t> </w:t>
+      </w:r>
+      <w:proofErr w:type="spellStart"/>
+      <w:r>
+        <w:rPr>
+          <w:rFonts w:eastAsia="Times New Roman" w:cs="Times New Roman"/>
+          <w:szCs w:val="24"/>
+          <w:lang w:eastAsia="ru-RU"/>
+        </w:rPr>
+        <w:t>dataset</w:t>
+      </w:r>
+      <w:proofErr w:type="spellEnd"/>
+      <w:r>
+        <w:rPr>
+          <w:rFonts w:eastAsia="Times New Roman" w:cs="Times New Roman"/>
+          <w:szCs w:val="24"/>
+          <w:lang w:eastAsia="ru-RU"/>
+        </w:rPr>
+        <w:t>.</w:t>
       </w:r>
     </w:p>
     <w:p>
@@ -822,8 +1006,33 @@
           <w:szCs w:val="28"/>
           <w:lang w:eastAsia="ru-RU"/>
         </w:rPr>
-        <w:t>1. Парсинг типа задачи (</w:t>
-      </w:r>
+        <w:t xml:space="preserve">1. </w:t>
+      </w:r>
+      <w:proofErr w:type="spellStart"/>
+      <w:r>
+        <w:rPr>
+          <w:rFonts w:eastAsia="Times New Roman" w:cs="Times New Roman"/>
+          <w:b/>
+          <w:bCs/>
+          <w:sz w:val="28"/>
+          <w:szCs w:val="28"/>
+          <w:lang w:eastAsia="ru-RU"/>
+        </w:rPr>
+        <w:t>Парсинг</w:t>
+      </w:r>
+      <w:proofErr w:type="spellEnd"/>
+      <w:r>
+        <w:rPr>
+          <w:rFonts w:eastAsia="Times New Roman" w:cs="Times New Roman"/>
+          <w:b/>
+          <w:bCs/>
+          <w:sz w:val="28"/>
+          <w:szCs w:val="28"/>
+          <w:lang w:eastAsia="ru-RU"/>
+        </w:rPr>
+        <w:t xml:space="preserve"> типа задачи (</w:t>
+      </w:r>
+      <w:proofErr w:type="spellStart"/>
       <w:r>
         <w:rPr>
           <w:rFonts w:ascii="Consolas" w:eastAsia="Times New Roman" w:hAnsi="Consolas" w:cs="Times New Roman"/>
@@ -835,6 +1044,7 @@
         </w:rPr>
         <w:t>parse_task_type</w:t>
       </w:r>
+      <w:proofErr w:type="spellEnd"/>
       <w:r>
         <w:rPr>
           <w:rFonts w:eastAsia="Times New Roman" w:cs="Times New Roman"/>
@@ -991,6 +1201,7 @@
                 <w:lang w:eastAsia="ru-RU"/>
               </w:rPr>
             </w:pPr>
+            <w:proofErr w:type="spellStart"/>
             <w:r>
               <w:rPr>
                 <w:rFonts w:eastAsia="Times New Roman" w:cs="Times New Roman"/>
@@ -1001,6 +1212,7 @@
               </w:rPr>
               <w:t>Positive</w:t>
             </w:r>
+            <w:proofErr w:type="spellEnd"/>
             <w:r>
               <w:rPr>
                 <w:rFonts w:eastAsia="Times New Roman" w:cs="Times New Roman"/>
@@ -1112,6 +1324,7 @@
                 <w:lang w:eastAsia="ru-RU"/>
               </w:rPr>
             </w:pPr>
+            <w:proofErr w:type="spellStart"/>
             <w:r>
               <w:rPr>
                 <w:rFonts w:eastAsia="Times New Roman" w:cs="Times New Roman"/>
@@ -1122,6 +1335,7 @@
               </w:rPr>
               <w:t>Negative</w:t>
             </w:r>
+            <w:proofErr w:type="spellEnd"/>
             <w:r>
               <w:rPr>
                 <w:rFonts w:eastAsia="Times New Roman" w:cs="Times New Roman"/>
@@ -1315,6 +1529,7 @@
               </w:rPr>
               <w:t> (Q33 — вернул только </w:t>
             </w:r>
+            <w:proofErr w:type="spellStart"/>
             <w:r>
               <w:rPr>
                 <w:rFonts w:ascii="Consolas" w:eastAsia="Times New Roman" w:hAnsi="Consolas" w:cs="Times New Roman"/>
@@ -1323,6 +1538,7 @@
               </w:rPr>
               <w:t>price</w:t>
             </w:r>
+            <w:proofErr w:type="spellEnd"/>
             <w:r>
               <w:rPr>
                 <w:rFonts w:eastAsia="Times New Roman" w:cs="Times New Roman"/>
@@ -1331,6 +1547,7 @@
               </w:rPr>
               <w:t>, пропустил </w:t>
             </w:r>
+            <w:proofErr w:type="spellStart"/>
             <w:r>
               <w:rPr>
                 <w:rFonts w:ascii="Consolas" w:eastAsia="Times New Roman" w:hAnsi="Consolas" w:cs="Times New Roman"/>
@@ -1339,6 +1556,7 @@
               </w:rPr>
               <w:t>sales</w:t>
             </w:r>
+            <w:proofErr w:type="spellEnd"/>
             <w:r>
               <w:rPr>
                 <w:rFonts w:eastAsia="Times New Roman" w:cs="Times New Roman"/>
@@ -1396,6 +1614,7 @@
           <w:lang w:eastAsia="ru-RU"/>
         </w:rPr>
       </w:pPr>
+      <w:proofErr w:type="spellStart"/>
       <w:r>
         <w:rPr>
           <w:rFonts w:eastAsia="Times New Roman" w:cs="Times New Roman"/>
@@ -1404,24 +1623,9 @@
           <w:szCs w:val="24"/>
           <w:lang w:eastAsia="ru-RU"/>
         </w:rPr>
-        <w:t>Recall = 49 / 50 = 98.0%</w:t>
-      </w:r>
-      <w:r>
-        <w:rPr>
-          <w:rFonts w:eastAsia="Times New Roman" w:cs="Times New Roman"/>
-          <w:szCs w:val="24"/>
-          <w:lang w:eastAsia="ru-RU"/>
-        </w:rPr>
-        <w:t> </w:t>
-      </w:r>
-      <w:r>
-        <w:rPr>
-          <w:rFonts w:ascii="Segoe UI Emoji" w:eastAsia="Times New Roman" w:hAnsi="Segoe UI Emoji" w:cs="Segoe UI Emoji"/>
-          <w:szCs w:val="24"/>
-          <w:lang w:eastAsia="ru-RU"/>
-        </w:rPr>
-        <w:t>✅</w:t>
-      </w:r>
+        <w:t>Recall</w:t>
+      </w:r>
+      <w:proofErr w:type="spellEnd"/>
       <w:r>
         <w:rPr>
           <w:rFonts w:eastAsia="Times New Roman" w:cs="Times New Roman"/>
@@ -1430,7 +1634,7 @@
           <w:szCs w:val="24"/>
           <w:lang w:eastAsia="ru-RU"/>
         </w:rPr>
-        <w:t>Specificity = 4 / 8 = 50.0%</w:t>
+        <w:t> = 49 / 50 = 98.0%</w:t>
       </w:r>
       <w:r>
         <w:rPr>
@@ -1446,6 +1650,44 @@
           <w:szCs w:val="24"/>
           <w:lang w:eastAsia="ru-RU"/>
         </w:rPr>
+        <w:t>✅</w:t>
+      </w:r>
+      <w:proofErr w:type="spellStart"/>
+      <w:r>
+        <w:rPr>
+          <w:rFonts w:eastAsia="Times New Roman" w:cs="Times New Roman"/>
+          <w:b/>
+          <w:bCs/>
+          <w:szCs w:val="24"/>
+          <w:lang w:eastAsia="ru-RU"/>
+        </w:rPr>
+        <w:t>Specificity</w:t>
+      </w:r>
+      <w:proofErr w:type="spellEnd"/>
+      <w:r>
+        <w:rPr>
+          <w:rFonts w:eastAsia="Times New Roman" w:cs="Times New Roman"/>
+          <w:b/>
+          <w:bCs/>
+          <w:szCs w:val="24"/>
+          <w:lang w:eastAsia="ru-RU"/>
+        </w:rPr>
+        <w:t xml:space="preserve"> = 4 / 8 = 50.0%</w:t>
+      </w:r>
+      <w:r>
+        <w:rPr>
+          <w:rFonts w:eastAsia="Times New Roman" w:cs="Times New Roman"/>
+          <w:szCs w:val="24"/>
+          <w:lang w:eastAsia="ru-RU"/>
+        </w:rPr>
+        <w:t> </w:t>
+      </w:r>
+      <w:r>
+        <w:rPr>
+          <w:rFonts w:ascii="Segoe UI Emoji" w:eastAsia="Times New Roman" w:hAnsi="Segoe UI Emoji" w:cs="Segoe UI Emoji"/>
+          <w:szCs w:val="24"/>
+          <w:lang w:eastAsia="ru-RU"/>
+        </w:rPr>
         <w:t>⚠️</w:t>
       </w:r>
       <w:r>
@@ -1454,7 +1696,25 @@
           <w:szCs w:val="24"/>
           <w:lang w:eastAsia="ru-RU"/>
         </w:rPr>
-        <w:t>&lt;details&gt;&lt;summary&gt;Подробности FP (ложно определил серию)&lt;/summary&gt;</w:t>
+        <w:t>&lt;details&gt;&lt;summary&gt;Подробности FP (ложно определил </w:t>
+      </w:r>
+      <w:proofErr w:type="gramStart"/>
+      <w:r>
+        <w:rPr>
+          <w:rFonts w:eastAsia="Times New Roman" w:cs="Times New Roman"/>
+          <w:szCs w:val="24"/>
+          <w:lang w:eastAsia="ru-RU"/>
+        </w:rPr>
+        <w:t>серию)&lt;</w:t>
+      </w:r>
+      <w:proofErr w:type="gramEnd"/>
+      <w:r>
+        <w:rPr>
+          <w:rFonts w:eastAsia="Times New Roman" w:cs="Times New Roman"/>
+          <w:szCs w:val="24"/>
+          <w:lang w:eastAsia="ru-RU"/>
+        </w:rPr>
+        <w:t>/summary&gt;</w:t>
       </w:r>
     </w:p>
     <w:tbl>
@@ -1750,6 +2010,7 @@
                 <w:lang w:eastAsia="ru-RU"/>
               </w:rPr>
             </w:pPr>
+            <w:proofErr w:type="spellStart"/>
             <w:r>
               <w:rPr>
                 <w:rFonts w:eastAsia="Times New Roman" w:cs="Times New Roman"/>
@@ -1758,30 +2019,32 @@
               </w:rPr>
               <w:t>null</w:t>
             </w:r>
-          </w:p>
-        </w:tc>
-        <w:tc>
-          <w:tcPr>
-            <w:tcW w:w="0" w:type="auto"/>
-            <w:noWrap/>
-            <w:tcMar>
-              <w:top w:w="75" w:type="dxa"/>
-              <w:left w:w="135" w:type="dxa"/>
-              <w:bottom w:w="75" w:type="dxa"/>
-              <w:right w:w="135" w:type="dxa"/>
-            </w:tcMar>
-            <w:vAlign w:val="center"/>
-            <w:hideMark/>
-          </w:tcPr>
-          <w:p>
-            <w:pPr>
-              <w:spacing w:after="0" w:line="240" w:lineRule="auto"/>
-              <w:rPr>
-                <w:rFonts w:eastAsia="Times New Roman" w:cs="Times New Roman"/>
-                <w:szCs w:val="24"/>
-                <w:lang w:eastAsia="ru-RU"/>
-              </w:rPr>
-            </w:pPr>
+            <w:proofErr w:type="spellEnd"/>
+          </w:p>
+        </w:tc>
+        <w:tc>
+          <w:tcPr>
+            <w:tcW w:w="0" w:type="auto"/>
+            <w:noWrap/>
+            <w:tcMar>
+              <w:top w:w="75" w:type="dxa"/>
+              <w:left w:w="135" w:type="dxa"/>
+              <w:bottom w:w="75" w:type="dxa"/>
+              <w:right w:w="135" w:type="dxa"/>
+            </w:tcMar>
+            <w:vAlign w:val="center"/>
+            <w:hideMark/>
+          </w:tcPr>
+          <w:p>
+            <w:pPr>
+              <w:spacing w:after="0" w:line="240" w:lineRule="auto"/>
+              <w:rPr>
+                <w:rFonts w:eastAsia="Times New Roman" w:cs="Times New Roman"/>
+                <w:szCs w:val="24"/>
+                <w:lang w:eastAsia="ru-RU"/>
+              </w:rPr>
+            </w:pPr>
+            <w:proofErr w:type="spellStart"/>
             <w:r>
               <w:rPr>
                 <w:rFonts w:eastAsia="Times New Roman" w:cs="Times New Roman"/>
@@ -1790,6 +2053,7 @@
               </w:rPr>
               <w:t>sales</w:t>
             </w:r>
+            <w:proofErr w:type="spellEnd"/>
           </w:p>
         </w:tc>
         <w:tc>
@@ -1915,6 +2179,7 @@
                 <w:lang w:eastAsia="ru-RU"/>
               </w:rPr>
             </w:pPr>
+            <w:proofErr w:type="spellStart"/>
             <w:r>
               <w:rPr>
                 <w:rFonts w:eastAsia="Times New Roman" w:cs="Times New Roman"/>
@@ -1923,30 +2188,32 @@
               </w:rPr>
               <w:t>null</w:t>
             </w:r>
-          </w:p>
-        </w:tc>
-        <w:tc>
-          <w:tcPr>
-            <w:tcW w:w="0" w:type="auto"/>
-            <w:noWrap/>
-            <w:tcMar>
-              <w:top w:w="75" w:type="dxa"/>
-              <w:left w:w="135" w:type="dxa"/>
-              <w:bottom w:w="75" w:type="dxa"/>
-              <w:right w:w="135" w:type="dxa"/>
-            </w:tcMar>
-            <w:vAlign w:val="center"/>
-            <w:hideMark/>
-          </w:tcPr>
-          <w:p>
-            <w:pPr>
-              <w:spacing w:after="0" w:line="240" w:lineRule="auto"/>
-              <w:rPr>
-                <w:rFonts w:eastAsia="Times New Roman" w:cs="Times New Roman"/>
-                <w:szCs w:val="24"/>
-                <w:lang w:eastAsia="ru-RU"/>
-              </w:rPr>
-            </w:pPr>
+            <w:proofErr w:type="spellEnd"/>
+          </w:p>
+        </w:tc>
+        <w:tc>
+          <w:tcPr>
+            <w:tcW w:w="0" w:type="auto"/>
+            <w:noWrap/>
+            <w:tcMar>
+              <w:top w:w="75" w:type="dxa"/>
+              <w:left w:w="135" w:type="dxa"/>
+              <w:bottom w:w="75" w:type="dxa"/>
+              <w:right w:w="135" w:type="dxa"/>
+            </w:tcMar>
+            <w:vAlign w:val="center"/>
+            <w:hideMark/>
+          </w:tcPr>
+          <w:p>
+            <w:pPr>
+              <w:spacing w:after="0" w:line="240" w:lineRule="auto"/>
+              <w:rPr>
+                <w:rFonts w:eastAsia="Times New Roman" w:cs="Times New Roman"/>
+                <w:szCs w:val="24"/>
+                <w:lang w:eastAsia="ru-RU"/>
+              </w:rPr>
+            </w:pPr>
+            <w:proofErr w:type="spellStart"/>
             <w:r>
               <w:rPr>
                 <w:rFonts w:eastAsia="Times New Roman" w:cs="Times New Roman"/>
@@ -1955,6 +2222,7 @@
               </w:rPr>
               <w:t>price</w:t>
             </w:r>
+            <w:proofErr w:type="spellEnd"/>
           </w:p>
         </w:tc>
         <w:tc>
@@ -2080,6 +2348,7 @@
                 <w:lang w:eastAsia="ru-RU"/>
               </w:rPr>
             </w:pPr>
+            <w:proofErr w:type="spellStart"/>
             <w:r>
               <w:rPr>
                 <w:rFonts w:eastAsia="Times New Roman" w:cs="Times New Roman"/>
@@ -2088,30 +2357,32 @@
               </w:rPr>
               <w:t>null</w:t>
             </w:r>
-          </w:p>
-        </w:tc>
-        <w:tc>
-          <w:tcPr>
-            <w:tcW w:w="0" w:type="auto"/>
-            <w:noWrap/>
-            <w:tcMar>
-              <w:top w:w="75" w:type="dxa"/>
-              <w:left w:w="135" w:type="dxa"/>
-              <w:bottom w:w="75" w:type="dxa"/>
-              <w:right w:w="135" w:type="dxa"/>
-            </w:tcMar>
-            <w:vAlign w:val="center"/>
-            <w:hideMark/>
-          </w:tcPr>
-          <w:p>
-            <w:pPr>
-              <w:spacing w:after="0" w:line="240" w:lineRule="auto"/>
-              <w:rPr>
-                <w:rFonts w:eastAsia="Times New Roman" w:cs="Times New Roman"/>
-                <w:szCs w:val="24"/>
-                <w:lang w:eastAsia="ru-RU"/>
-              </w:rPr>
-            </w:pPr>
+            <w:proofErr w:type="spellEnd"/>
+          </w:p>
+        </w:tc>
+        <w:tc>
+          <w:tcPr>
+            <w:tcW w:w="0" w:type="auto"/>
+            <w:noWrap/>
+            <w:tcMar>
+              <w:top w:w="75" w:type="dxa"/>
+              <w:left w:w="135" w:type="dxa"/>
+              <w:bottom w:w="75" w:type="dxa"/>
+              <w:right w:w="135" w:type="dxa"/>
+            </w:tcMar>
+            <w:vAlign w:val="center"/>
+            <w:hideMark/>
+          </w:tcPr>
+          <w:p>
+            <w:pPr>
+              <w:spacing w:after="0" w:line="240" w:lineRule="auto"/>
+              <w:rPr>
+                <w:rFonts w:eastAsia="Times New Roman" w:cs="Times New Roman"/>
+                <w:szCs w:val="24"/>
+                <w:lang w:eastAsia="ru-RU"/>
+              </w:rPr>
+            </w:pPr>
+            <w:proofErr w:type="spellStart"/>
             <w:r>
               <w:rPr>
                 <w:rFonts w:eastAsia="Times New Roman" w:cs="Times New Roman"/>
@@ -2120,6 +2391,7 @@
               </w:rPr>
               <w:t>price</w:t>
             </w:r>
+            <w:proofErr w:type="spellEnd"/>
           </w:p>
         </w:tc>
         <w:tc>
@@ -2225,7 +2497,25 @@
                 <w:szCs w:val="24"/>
                 <w:lang w:eastAsia="ru-RU"/>
               </w:rPr>
-              <w:t>Как выиграть поездку в дубай?</w:t>
+              <w:t xml:space="preserve">Как выиграть поездку в </w:t>
+            </w:r>
+            <w:proofErr w:type="spellStart"/>
+            <w:r>
+              <w:rPr>
+                <w:rFonts w:eastAsia="Times New Roman" w:cs="Times New Roman"/>
+                <w:szCs w:val="24"/>
+                <w:lang w:eastAsia="ru-RU"/>
+              </w:rPr>
+              <w:t>дубай</w:t>
+            </w:r>
+            <w:proofErr w:type="spellEnd"/>
+            <w:r>
+              <w:rPr>
+                <w:rFonts w:eastAsia="Times New Roman" w:cs="Times New Roman"/>
+                <w:szCs w:val="24"/>
+                <w:lang w:eastAsia="ru-RU"/>
+              </w:rPr>
+              <w:t>?</w:t>
             </w:r>
           </w:p>
         </w:tc>
@@ -2254,6 +2544,7 @@
                 <w:lang w:eastAsia="ru-RU"/>
               </w:rPr>
             </w:pPr>
+            <w:proofErr w:type="spellStart"/>
             <w:r>
               <w:rPr>
                 <w:rFonts w:eastAsia="Times New Roman" w:cs="Times New Roman"/>
@@ -2262,6 +2553,7 @@
               </w:rPr>
               <w:t>null</w:t>
             </w:r>
+            <w:proofErr w:type="spellEnd"/>
           </w:p>
         </w:tc>
         <w:tc>
@@ -2289,6 +2581,7 @@
                 <w:lang w:eastAsia="ru-RU"/>
               </w:rPr>
             </w:pPr>
+            <w:proofErr w:type="spellStart"/>
             <w:r>
               <w:rPr>
                 <w:rFonts w:eastAsia="Times New Roman" w:cs="Times New Roman"/>
@@ -2297,6 +2590,7 @@
               </w:rPr>
               <w:t>trips</w:t>
             </w:r>
+            <w:proofErr w:type="spellEnd"/>
           </w:p>
         </w:tc>
         <w:tc>
@@ -2352,7 +2646,26 @@
           <w:szCs w:val="24"/>
           <w:lang w:eastAsia="ru-RU"/>
         </w:rPr>
-        <w:t>&lt;/details&gt;</w:t>
+        <w:t>&lt;/</w:t>
+      </w:r>
+      <w:proofErr w:type="spellStart"/>
+      <w:proofErr w:type="gramStart"/>
+      <w:r>
+        <w:rPr>
+          <w:rFonts w:eastAsia="Times New Roman" w:cs="Times New Roman"/>
+          <w:szCs w:val="24"/>
+          <w:lang w:eastAsia="ru-RU"/>
+        </w:rPr>
+        <w:t>details</w:t>
+      </w:r>
+      <w:proofErr w:type="spellEnd"/>
+      <w:r>
+        <w:rPr>
+          <w:rFonts w:eastAsia="Times New Roman" w:cs="Times New Roman"/>
+          <w:szCs w:val="24"/>
+          <w:lang w:eastAsia="ru-RU"/>
+        </w:rPr>
+        <w:t>&gt;</w:t>
       </w:r>
       <w:r>
         <w:rPr>
@@ -2362,7 +2675,18 @@
           <w:szCs w:val="24"/>
           <w:lang w:eastAsia="ru-RU"/>
         </w:rPr>
-        <w:t>Вывод:</w:t>
+        <w:t>Вывод</w:t>
+      </w:r>
+      <w:proofErr w:type="gramEnd"/>
+      <w:r>
+        <w:rPr>
+          <w:rFonts w:eastAsia="Times New Roman" w:cs="Times New Roman"/>
+          <w:b/>
+          <w:bCs/>
+          <w:szCs w:val="24"/>
+          <w:lang w:eastAsia="ru-RU"/>
+        </w:rPr>
+        <w:t>:</w:t>
       </w:r>
       <w:r>
         <w:rPr>
@@ -2451,8 +2775,33 @@
           <w:szCs w:val="28"/>
           <w:lang w:eastAsia="ru-RU"/>
         </w:rPr>
-        <w:t>2. Парсинг дат (</w:t>
-      </w:r>
+        <w:t xml:space="preserve">2. </w:t>
+      </w:r>
+      <w:proofErr w:type="spellStart"/>
+      <w:r>
+        <w:rPr>
+          <w:rFonts w:eastAsia="Times New Roman" w:cs="Times New Roman"/>
+          <w:b/>
+          <w:bCs/>
+          <w:sz w:val="28"/>
+          <w:szCs w:val="28"/>
+          <w:lang w:eastAsia="ru-RU"/>
+        </w:rPr>
+        <w:t>Парсинг</w:t>
+      </w:r>
+      <w:proofErr w:type="spellEnd"/>
+      <w:r>
+        <w:rPr>
+          <w:rFonts w:eastAsia="Times New Roman" w:cs="Times New Roman"/>
+          <w:b/>
+          <w:bCs/>
+          <w:sz w:val="28"/>
+          <w:szCs w:val="28"/>
+          <w:lang w:eastAsia="ru-RU"/>
+        </w:rPr>
+        <w:t xml:space="preserve"> дат (</w:t>
+      </w:r>
+      <w:proofErr w:type="spellStart"/>
       <w:r>
         <w:rPr>
           <w:rFonts w:ascii="Consolas" w:eastAsia="Times New Roman" w:hAnsi="Consolas" w:cs="Times New Roman"/>
@@ -2466,6 +2815,7 @@
         </w:rPr>
         <w:t>parse_date</w:t>
       </w:r>
+      <w:proofErr w:type="spellEnd"/>
       <w:r>
         <w:rPr>
           <w:rFonts w:eastAsia="Times New Roman" w:cs="Times New Roman"/>
@@ -2622,6 +2972,7 @@
                 <w:lang w:eastAsia="ru-RU"/>
               </w:rPr>
             </w:pPr>
+            <w:proofErr w:type="spellStart"/>
             <w:r>
               <w:rPr>
                 <w:rFonts w:eastAsia="Times New Roman" w:cs="Times New Roman"/>
@@ -2632,6 +2983,7 @@
               </w:rPr>
               <w:t>Positive</w:t>
             </w:r>
+            <w:proofErr w:type="spellEnd"/>
             <w:r>
               <w:rPr>
                 <w:rFonts w:eastAsia="Times New Roman" w:cs="Times New Roman"/>
@@ -2746,6 +3098,7 @@
                 <w:lang w:eastAsia="ru-RU"/>
               </w:rPr>
             </w:pPr>
+            <w:proofErr w:type="spellStart"/>
             <w:r>
               <w:rPr>
                 <w:rFonts w:eastAsia="Times New Roman" w:cs="Times New Roman"/>
@@ -2756,6 +3109,7 @@
               </w:rPr>
               <w:t>Negative</w:t>
             </w:r>
+            <w:proofErr w:type="spellEnd"/>
             <w:r>
               <w:rPr>
                 <w:rFonts w:eastAsia="Times New Roman" w:cs="Times New Roman"/>
@@ -2876,6 +3230,7 @@
           <w:lang w:eastAsia="ru-RU"/>
         </w:rPr>
       </w:pPr>
+      <w:proofErr w:type="spellStart"/>
       <w:r>
         <w:rPr>
           <w:rFonts w:eastAsia="Times New Roman" w:cs="Times New Roman"/>
@@ -2884,24 +3239,9 @@
           <w:szCs w:val="24"/>
           <w:lang w:eastAsia="ru-RU"/>
         </w:rPr>
-        <w:t>Recall = 22 / 40 = 55.0%</w:t>
-      </w:r>
-      <w:r>
-        <w:rPr>
-          <w:rFonts w:eastAsia="Times New Roman" w:cs="Times New Roman"/>
-          <w:szCs w:val="24"/>
-          <w:lang w:eastAsia="ru-RU"/>
-        </w:rPr>
-        <w:t> </w:t>
-      </w:r>
-      <w:r>
-        <w:rPr>
-          <w:rFonts w:ascii="Segoe UI Emoji" w:eastAsia="Times New Roman" w:hAnsi="Segoe UI Emoji" w:cs="Segoe UI Emoji"/>
-          <w:szCs w:val="24"/>
-          <w:lang w:eastAsia="ru-RU"/>
-        </w:rPr>
-        <w:t>❌</w:t>
-      </w:r>
+        <w:t>Recall</w:t>
+      </w:r>
+      <w:proofErr w:type="spellEnd"/>
       <w:r>
         <w:rPr>
           <w:rFonts w:eastAsia="Times New Roman" w:cs="Times New Roman"/>
@@ -2910,7 +3250,7 @@
           <w:szCs w:val="24"/>
           <w:lang w:eastAsia="ru-RU"/>
         </w:rPr>
-        <w:t>Specificity = 8 / 10 = 80.0%</w:t>
+        <w:t xml:space="preserve"> = 22 / 40 = 55.0%</w:t>
       </w:r>
       <w:r>
         <w:rPr>
@@ -2926,6 +3266,44 @@
           <w:szCs w:val="24"/>
           <w:lang w:eastAsia="ru-RU"/>
         </w:rPr>
+        <w:t>❌</w:t>
+      </w:r>
+      <w:proofErr w:type="spellStart"/>
+      <w:r>
+        <w:rPr>
+          <w:rFonts w:eastAsia="Times New Roman" w:cs="Times New Roman"/>
+          <w:b/>
+          <w:bCs/>
+          <w:szCs w:val="24"/>
+          <w:lang w:eastAsia="ru-RU"/>
+        </w:rPr>
+        <w:t>Specificity</w:t>
+      </w:r>
+      <w:proofErr w:type="spellEnd"/>
+      <w:r>
+        <w:rPr>
+          <w:rFonts w:eastAsia="Times New Roman" w:cs="Times New Roman"/>
+          <w:b/>
+          <w:bCs/>
+          <w:szCs w:val="24"/>
+          <w:lang w:eastAsia="ru-RU"/>
+        </w:rPr>
+        <w:t xml:space="preserve"> = 8 / 10 = 80.0%</w:t>
+      </w:r>
+      <w:r>
+        <w:rPr>
+          <w:rFonts w:eastAsia="Times New Roman" w:cs="Times New Roman"/>
+          <w:szCs w:val="24"/>
+          <w:lang w:eastAsia="ru-RU"/>
+        </w:rPr>
+        <w:t> </w:t>
+      </w:r>
+      <w:r>
+        <w:rPr>
+          <w:rFonts w:ascii="Segoe UI Emoji" w:eastAsia="Times New Roman" w:hAnsi="Segoe UI Emoji" w:cs="Segoe UI Emoji"/>
+          <w:szCs w:val="24"/>
+          <w:lang w:eastAsia="ru-RU"/>
+        </w:rPr>
         <w:t>✅</w:t>
       </w:r>
       <w:r>
@@ -2934,7 +3312,89 @@
           <w:szCs w:val="24"/>
           <w:lang w:eastAsia="ru-RU"/>
         </w:rPr>
-        <w:t>&lt;details&gt;&lt;summary&gt;Детальный разбор 18 ошибок парсинга дат&lt;/summary&gt;Ошибки группируются в </w:t>
+        <w:t>&lt;</w:t>
+      </w:r>
+      <w:proofErr w:type="spellStart"/>
+      <w:r>
+        <w:rPr>
+          <w:rFonts w:eastAsia="Times New Roman" w:cs="Times New Roman"/>
+          <w:szCs w:val="24"/>
+          <w:lang w:eastAsia="ru-RU"/>
+        </w:rPr>
+        <w:t>details</w:t>
+      </w:r>
+      <w:proofErr w:type="spellEnd"/>
+      <w:r>
+        <w:rPr>
+          <w:rFonts w:eastAsia="Times New Roman" w:cs="Times New Roman"/>
+          <w:szCs w:val="24"/>
+          <w:lang w:eastAsia="ru-RU"/>
+        </w:rPr>
+        <w:t>&gt;&lt;</w:t>
+      </w:r>
+      <w:proofErr w:type="spellStart"/>
+      <w:r>
+        <w:rPr>
+          <w:rFonts w:eastAsia="Times New Roman" w:cs="Times New Roman"/>
+          <w:szCs w:val="24"/>
+          <w:lang w:eastAsia="ru-RU"/>
+        </w:rPr>
+        <w:t>summary</w:t>
+      </w:r>
+      <w:proofErr w:type="spellEnd"/>
+      <w:r>
+        <w:rPr>
+          <w:rFonts w:eastAsia="Times New Roman" w:cs="Times New Roman"/>
+          <w:szCs w:val="24"/>
+          <w:lang w:eastAsia="ru-RU"/>
+        </w:rPr>
+        <w:t xml:space="preserve">&gt;Детальный разбор 18 ошибок </w:t>
+      </w:r>
+      <w:proofErr w:type="spellStart"/>
+      <w:r>
+        <w:rPr>
+          <w:rFonts w:eastAsia="Times New Roman" w:cs="Times New Roman"/>
+          <w:szCs w:val="24"/>
+          <w:lang w:eastAsia="ru-RU"/>
+        </w:rPr>
+        <w:t>парсинга</w:t>
+      </w:r>
+      <w:proofErr w:type="spellEnd"/>
+      <w:r>
+        <w:rPr>
+          <w:rFonts w:eastAsia="Times New Roman" w:cs="Times New Roman"/>
+          <w:szCs w:val="24"/>
+          <w:lang w:eastAsia="ru-RU"/>
+        </w:rPr>
+        <w:t xml:space="preserve"> дат&lt;/</w:t>
+      </w:r>
+      <w:proofErr w:type="spellStart"/>
+      <w:proofErr w:type="gramStart"/>
+      <w:r>
+        <w:rPr>
+          <w:rFonts w:eastAsia="Times New Roman" w:cs="Times New Roman"/>
+          <w:szCs w:val="24"/>
+          <w:lang w:eastAsia="ru-RU"/>
+        </w:rPr>
+        <w:t>summary</w:t>
+      </w:r>
+      <w:proofErr w:type="spellEnd"/>
+      <w:r>
+        <w:rPr>
+          <w:rFonts w:eastAsia="Times New Roman" w:cs="Times New Roman"/>
+          <w:szCs w:val="24"/>
+          <w:lang w:eastAsia="ru-RU"/>
+        </w:rPr>
+        <w:t>&gt;Ошибки</w:t>
+      </w:r>
+      <w:proofErr w:type="gramEnd"/>
+      <w:r>
+        <w:rPr>
+          <w:rFonts w:eastAsia="Times New Roman" w:cs="Times New Roman"/>
+          <w:szCs w:val="24"/>
+          <w:lang w:eastAsia="ru-RU"/>
+        </w:rPr>
+        <w:t xml:space="preserve"> группируются в </w:t>
       </w:r>
       <w:r>
         <w:rPr>
@@ -3008,6 +3468,7 @@
                 <w:szCs w:val="24"/>
                 <w:lang w:eastAsia="ru-RU"/>
               </w:rPr>
+              <w:lastRenderedPageBreak/>
               <w:t>Паттерн</w:t>
             </w:r>
           </w:p>
@@ -3254,7 +3715,43 @@
                 <w:szCs w:val="24"/>
                 <w:lang w:eastAsia="ru-RU"/>
               </w:rPr>
-              <w:t>Агент считает «ближайшие 7 дней от завтра» (03-03→03-09) вместо «Пн–Вс следующей недели» (03-09→03-15)</w:t>
+              <w:t>Агент считает «ближайшие 7 дней от завтра» (03-03→03-09) вместо «</w:t>
+            </w:r>
+            <w:proofErr w:type="spellStart"/>
+            <w:r>
+              <w:rPr>
+                <w:rFonts w:eastAsia="Times New Roman" w:cs="Times New Roman"/>
+                <w:szCs w:val="24"/>
+                <w:lang w:eastAsia="ru-RU"/>
+              </w:rPr>
+              <w:t>Пн</w:t>
+            </w:r>
+            <w:proofErr w:type="spellEnd"/>
+            <w:r>
+              <w:rPr>
+                <w:rFonts w:eastAsia="Times New Roman" w:cs="Times New Roman"/>
+                <w:szCs w:val="24"/>
+                <w:lang w:eastAsia="ru-RU"/>
+              </w:rPr>
+              <w:t>–</w:t>
+            </w:r>
+            <w:proofErr w:type="spellStart"/>
+            <w:r>
+              <w:rPr>
+                <w:rFonts w:eastAsia="Times New Roman" w:cs="Times New Roman"/>
+                <w:szCs w:val="24"/>
+                <w:lang w:eastAsia="ru-RU"/>
+              </w:rPr>
+              <w:t>Вс</w:t>
+            </w:r>
+            <w:proofErr w:type="spellEnd"/>
+            <w:r>
+              <w:rPr>
+                <w:rFonts w:eastAsia="Times New Roman" w:cs="Times New Roman"/>
+                <w:szCs w:val="24"/>
+                <w:lang w:eastAsia="ru-RU"/>
+              </w:rPr>
+              <w:t xml:space="preserve"> следующей недели» (03-09→03-15)</w:t>
             </w:r>
           </w:p>
         </w:tc>
@@ -3389,7 +3886,25 @@
                 <w:szCs w:val="24"/>
                 <w:lang w:eastAsia="ru-RU"/>
               </w:rPr>
-              <w:t>Агент берёт текущий месяц (03-02→03-31) вместо следующего (04-01→04-30). Q28 — возвращает range вместо одной даты</w:t>
+              <w:t xml:space="preserve">Агент берёт текущий месяц (03-02→03-31) вместо следующего (04-01→04-30). Q28 — возвращает </w:t>
+            </w:r>
+            <w:proofErr w:type="spellStart"/>
+            <w:r>
+              <w:rPr>
+                <w:rFonts w:eastAsia="Times New Roman" w:cs="Times New Roman"/>
+                <w:szCs w:val="24"/>
+                <w:lang w:eastAsia="ru-RU"/>
+              </w:rPr>
+              <w:t>range</w:t>
+            </w:r>
+            <w:proofErr w:type="spellEnd"/>
+            <w:r>
+              <w:rPr>
+                <w:rFonts w:eastAsia="Times New Roman" w:cs="Times New Roman"/>
+                <w:szCs w:val="24"/>
+                <w:lang w:eastAsia="ru-RU"/>
+              </w:rPr>
+              <w:t xml:space="preserve"> вместо одной даты</w:t>
             </w:r>
           </w:p>
         </w:tc>
@@ -3423,16 +3938,7 @@
                 <w:szCs w:val="24"/>
                 <w:lang w:eastAsia="ru-RU"/>
               </w:rPr>
-              <w:t xml:space="preserve">«Следующий </w:t>
-            </w:r>
-            <w:r>
-              <w:rPr>
-                <w:rFonts w:eastAsia="Times New Roman" w:cs="Times New Roman"/>
-                <w:szCs w:val="24"/>
-                <w:lang w:eastAsia="ru-RU"/>
-              </w:rPr>
-              <w:lastRenderedPageBreak/>
-              <w:t>день недели»</w:t>
+              <w:t>«Следующий день недели»</w:t>
             </w:r>
           </w:p>
         </w:tc>
@@ -3466,7 +3972,6 @@
                 <w:szCs w:val="24"/>
                 <w:lang w:eastAsia="ru-RU"/>
               </w:rPr>
-              <w:lastRenderedPageBreak/>
               <w:t>3</w:t>
             </w:r>
           </w:p>
@@ -3534,7 +4039,43 @@
                 <w:szCs w:val="24"/>
                 <w:lang w:eastAsia="ru-RU"/>
               </w:rPr>
-              <w:t>«Следующий понедельник» → 03-03 (вт) вместо 03-09. «Следующая пятница» → 03-07 (сб) вместо 03-06</w:t>
+              <w:t>«Следующий понедельник» → 03-03 (</w:t>
+            </w:r>
+            <w:proofErr w:type="spellStart"/>
+            <w:r>
+              <w:rPr>
+                <w:rFonts w:eastAsia="Times New Roman" w:cs="Times New Roman"/>
+                <w:szCs w:val="24"/>
+                <w:lang w:eastAsia="ru-RU"/>
+              </w:rPr>
+              <w:t>вт</w:t>
+            </w:r>
+            <w:proofErr w:type="spellEnd"/>
+            <w:r>
+              <w:rPr>
+                <w:rFonts w:eastAsia="Times New Roman" w:cs="Times New Roman"/>
+                <w:szCs w:val="24"/>
+                <w:lang w:eastAsia="ru-RU"/>
+              </w:rPr>
+              <w:t>) вместо 03-09. «Следующая пятница» → 03-07 (</w:t>
+            </w:r>
+            <w:proofErr w:type="spellStart"/>
+            <w:r>
+              <w:rPr>
+                <w:rFonts w:eastAsia="Times New Roman" w:cs="Times New Roman"/>
+                <w:szCs w:val="24"/>
+                <w:lang w:eastAsia="ru-RU"/>
+              </w:rPr>
+              <w:t>сб</w:t>
+            </w:r>
+            <w:proofErr w:type="spellEnd"/>
+            <w:r>
+              <w:rPr>
+                <w:rFonts w:eastAsia="Times New Roman" w:cs="Times New Roman"/>
+                <w:szCs w:val="24"/>
+                <w:lang w:eastAsia="ru-RU"/>
+              </w:rPr>
+              <w:t>) вместо 03-06</w:t>
             </w:r>
           </w:p>
         </w:tc>
@@ -3559,16 +4100,48 @@
               <w:rPr>
                 <w:rFonts w:eastAsia="Times New Roman" w:cs="Times New Roman"/>
                 <w:szCs w:val="24"/>
-                <w:lang w:eastAsia="ru-RU"/>
-              </w:rPr>
-            </w:pPr>
-            <w:r>
-              <w:rPr>
-                <w:rFonts w:eastAsia="Times New Roman" w:cs="Times New Roman"/>
-                <w:szCs w:val="24"/>
-                <w:lang w:eastAsia="ru-RU"/>
-              </w:rPr>
-              <w:t>«Через N дней» off-by-1</w:t>
+                <w:lang w:val="en-US" w:eastAsia="ru-RU"/>
+              </w:rPr>
+            </w:pPr>
+            <w:r>
+              <w:rPr>
+                <w:rFonts w:eastAsia="Times New Roman" w:cs="Times New Roman"/>
+                <w:szCs w:val="24"/>
+                <w:lang w:val="en-US" w:eastAsia="ru-RU"/>
+              </w:rPr>
+              <w:t>«</w:t>
+            </w:r>
+            <w:r>
+              <w:rPr>
+                <w:rFonts w:eastAsia="Times New Roman" w:cs="Times New Roman"/>
+                <w:szCs w:val="24"/>
+                <w:lang w:eastAsia="ru-RU"/>
+              </w:rPr>
+              <w:t>Через</w:t>
+            </w:r>
+            <w:r>
+              <w:rPr>
+                <w:rFonts w:eastAsia="Times New Roman" w:cs="Times New Roman"/>
+                <w:szCs w:val="24"/>
+                <w:lang w:val="en-US" w:eastAsia="ru-RU"/>
+              </w:rPr>
+              <w:t xml:space="preserve"> N </w:t>
+            </w:r>
+            <w:r>
+              <w:rPr>
+                <w:rFonts w:eastAsia="Times New Roman" w:cs="Times New Roman"/>
+                <w:szCs w:val="24"/>
+                <w:lang w:eastAsia="ru-RU"/>
+              </w:rPr>
+              <w:t>дней</w:t>
+            </w:r>
+            <w:r>
+              <w:rPr>
+                <w:rFonts w:eastAsia="Times New Roman" w:cs="Times New Roman"/>
+                <w:szCs w:val="24"/>
+                <w:lang w:val="en-US" w:eastAsia="ru-RU"/>
+              </w:rPr>
+              <w:t>» off-by-1</w:t>
             </w:r>
           </w:p>
         </w:tc>
@@ -3814,7 +4387,25 @@
                 <w:szCs w:val="24"/>
                 <w:lang w:eastAsia="ru-RU"/>
               </w:rPr>
-              <w:t>«Полгода» → 08-31 вместо 09-02. «От последней даты в данных» → null. Расширенные диапазоны</w:t>
+              <w:t xml:space="preserve">«Полгода» → 08-31 вместо 09-02. «От последней даты в данных» → </w:t>
+            </w:r>
+            <w:proofErr w:type="spellStart"/>
+            <w:r>
+              <w:rPr>
+                <w:rFonts w:eastAsia="Times New Roman" w:cs="Times New Roman"/>
+                <w:szCs w:val="24"/>
+                <w:lang w:eastAsia="ru-RU"/>
+              </w:rPr>
+              <w:t>null</w:t>
+            </w:r>
+            <w:proofErr w:type="spellEnd"/>
+            <w:r>
+              <w:rPr>
+                <w:rFonts w:eastAsia="Times New Roman" w:cs="Times New Roman"/>
+                <w:szCs w:val="24"/>
+                <w:lang w:eastAsia="ru-RU"/>
+              </w:rPr>
+              <w:t>. Расширенные диапазоны</w:t>
             </w:r>
           </w:p>
         </w:tc>
@@ -3826,16 +4417,122 @@
         <w:rPr>
           <w:rFonts w:eastAsia="Times New Roman" w:cs="Times New Roman"/>
           <w:szCs w:val="24"/>
-          <w:lang w:eastAsia="ru-RU"/>
-        </w:rPr>
-      </w:pPr>
-      <w:r>
-        <w:rPr>
-          <w:rFonts w:eastAsia="Times New Roman" w:cs="Times New Roman"/>
-          <w:szCs w:val="24"/>
-          <w:lang w:eastAsia="ru-RU"/>
-        </w:rPr>
-        <w:t>&lt;/details&gt;&lt;details&gt;&lt;summary&gt;FP даты (нашёл дату, когда её нет)&lt;/summary&gt;</w:t>
+          <w:lang w:val="en-US" w:eastAsia="ru-RU"/>
+        </w:rPr>
+      </w:pPr>
+      <w:r>
+        <w:rPr>
+          <w:rFonts w:eastAsia="Times New Roman" w:cs="Times New Roman"/>
+          <w:szCs w:val="24"/>
+          <w:lang w:val="en-US" w:eastAsia="ru-RU"/>
+        </w:rPr>
+        <w:t>&lt;/details&gt;&lt;details&gt;&lt;summary&gt;FP </w:t>
+      </w:r>
+      <w:r>
+        <w:rPr>
+          <w:rFonts w:eastAsia="Times New Roman" w:cs="Times New Roman"/>
+          <w:szCs w:val="24"/>
+          <w:lang w:eastAsia="ru-RU"/>
+        </w:rPr>
+        <w:t>даты</w:t>
+      </w:r>
+      <w:r>
+        <w:rPr>
+          <w:rFonts w:eastAsia="Times New Roman" w:cs="Times New Roman"/>
+          <w:szCs w:val="24"/>
+          <w:lang w:val="en-US" w:eastAsia="ru-RU"/>
+        </w:rPr>
+        <w:t xml:space="preserve"> (</w:t>
+      </w:r>
+      <w:r>
+        <w:rPr>
+          <w:rFonts w:eastAsia="Times New Roman" w:cs="Times New Roman"/>
+          <w:szCs w:val="24"/>
+          <w:lang w:eastAsia="ru-RU"/>
+        </w:rPr>
+        <w:t>нашёл</w:t>
+      </w:r>
+      <w:r>
+        <w:rPr>
+          <w:rFonts w:eastAsia="Times New Roman" w:cs="Times New Roman"/>
+          <w:szCs w:val="24"/>
+          <w:lang w:val="en-US" w:eastAsia="ru-RU"/>
+        </w:rPr>
+        <w:t xml:space="preserve"> </w:t>
+      </w:r>
+      <w:r>
+        <w:rPr>
+          <w:rFonts w:eastAsia="Times New Roman" w:cs="Times New Roman"/>
+          <w:szCs w:val="24"/>
+          <w:lang w:eastAsia="ru-RU"/>
+        </w:rPr>
+        <w:t>дату</w:t>
+      </w:r>
+      <w:r>
+        <w:rPr>
+          <w:rFonts w:eastAsia="Times New Roman" w:cs="Times New Roman"/>
+          <w:szCs w:val="24"/>
+          <w:lang w:val="en-US" w:eastAsia="ru-RU"/>
+        </w:rPr>
+        <w:t xml:space="preserve">, </w:t>
+      </w:r>
+      <w:r>
+        <w:rPr>
+          <w:rFonts w:eastAsia="Times New Roman" w:cs="Times New Roman"/>
+          <w:szCs w:val="24"/>
+          <w:lang w:eastAsia="ru-RU"/>
+        </w:rPr>
+        <w:t>когда</w:t>
+      </w:r>
+      <w:r>
+        <w:rPr>
+          <w:rFonts w:eastAsia="Times New Roman" w:cs="Times New Roman"/>
+          <w:szCs w:val="24"/>
+          <w:lang w:val="en-US" w:eastAsia="ru-RU"/>
+        </w:rPr>
+        <w:t xml:space="preserve"> </w:t>
+      </w:r>
+      <w:r>
+        <w:rPr>
+          <w:rFonts w:eastAsia="Times New Roman" w:cs="Times New Roman"/>
+          <w:szCs w:val="24"/>
+          <w:lang w:eastAsia="ru-RU"/>
+        </w:rPr>
+        <w:t>её</w:t>
+      </w:r>
+      <w:r>
+        <w:rPr>
+          <w:rFonts w:eastAsia="Times New Roman" w:cs="Times New Roman"/>
+          <w:szCs w:val="24"/>
+          <w:lang w:val="en-US" w:eastAsia="ru-RU"/>
+        </w:rPr>
+        <w:t xml:space="preserve"> </w:t>
+      </w:r>
+      <w:proofErr w:type="gramStart"/>
+      <w:r>
+        <w:rPr>
+          <w:rFonts w:eastAsia="Times New Roman" w:cs="Times New Roman"/>
+          <w:szCs w:val="24"/>
+          <w:lang w:eastAsia="ru-RU"/>
+        </w:rPr>
+        <w:t>нет</w:t>
+      </w:r>
+      <w:r>
+        <w:rPr>
+          <w:rFonts w:eastAsia="Times New Roman" w:cs="Times New Roman"/>
+          <w:szCs w:val="24"/>
+          <w:lang w:val="en-US" w:eastAsia="ru-RU"/>
+        </w:rPr>
+        <w:t>)&lt;</w:t>
+      </w:r>
+      <w:proofErr w:type="gramEnd"/>
+      <w:r>
+        <w:rPr>
+          <w:rFonts w:eastAsia="Times New Roman" w:cs="Times New Roman"/>
+          <w:szCs w:val="24"/>
+          <w:lang w:val="en-US" w:eastAsia="ru-RU"/>
+        </w:rPr>
+        <w:t>/summary&gt;</w:t>
       </w:r>
     </w:p>
     <w:tbl>
@@ -4094,6 +4791,7 @@
                 <w:lang w:eastAsia="ru-RU"/>
               </w:rPr>
             </w:pPr>
+            <w:proofErr w:type="spellStart"/>
             <w:r>
               <w:rPr>
                 <w:rFonts w:eastAsia="Times New Roman" w:cs="Times New Roman"/>
@@ -4102,6 +4800,7 @@
               </w:rPr>
               <w:t>null</w:t>
             </w:r>
+            <w:proofErr w:type="spellEnd"/>
           </w:p>
         </w:tc>
         <w:tc>
@@ -4236,6 +4935,7 @@
                 <w:lang w:eastAsia="ru-RU"/>
               </w:rPr>
             </w:pPr>
+            <w:proofErr w:type="spellStart"/>
             <w:r>
               <w:rPr>
                 <w:rFonts w:eastAsia="Times New Roman" w:cs="Times New Roman"/>
@@ -4244,6 +4944,7 @@
               </w:rPr>
               <w:t>null</w:t>
             </w:r>
+            <w:proofErr w:type="spellEnd"/>
           </w:p>
         </w:tc>
         <w:tc>
@@ -4299,7 +5000,43 @@
           <w:szCs w:val="24"/>
           <w:lang w:eastAsia="ru-RU"/>
         </w:rPr>
-        <w:t>Агент интерпретировал «дальше» и «в ближайшее время» как «сегодня».&lt;/details&gt;</w:t>
+        <w:t>Агент интерпретировал «дальше» и «в ближайшее время» как «сегодня</w:t>
+      </w:r>
+      <w:proofErr w:type="gramStart"/>
+      <w:r>
+        <w:rPr>
+          <w:rFonts w:eastAsia="Times New Roman" w:cs="Times New Roman"/>
+          <w:szCs w:val="24"/>
+          <w:lang w:eastAsia="ru-RU"/>
+        </w:rPr>
+        <w:t>».&lt;</w:t>
+      </w:r>
+      <w:proofErr w:type="gramEnd"/>
+      <w:r>
+        <w:rPr>
+          <w:rFonts w:eastAsia="Times New Roman" w:cs="Times New Roman"/>
+          <w:szCs w:val="24"/>
+          <w:lang w:eastAsia="ru-RU"/>
+        </w:rPr>
+        <w:t>/</w:t>
+      </w:r>
+      <w:proofErr w:type="spellStart"/>
+      <w:r>
+        <w:rPr>
+          <w:rFonts w:eastAsia="Times New Roman" w:cs="Times New Roman"/>
+          <w:szCs w:val="24"/>
+          <w:lang w:eastAsia="ru-RU"/>
+        </w:rPr>
+        <w:t>details</w:t>
+      </w:r>
+      <w:proofErr w:type="spellEnd"/>
+      <w:r>
+        <w:rPr>
+          <w:rFonts w:eastAsia="Times New Roman" w:cs="Times New Roman"/>
+          <w:szCs w:val="24"/>
+          <w:lang w:eastAsia="ru-RU"/>
+        </w:rPr>
+        <w:t>&gt;</w:t>
       </w:r>
       <w:r>
         <w:rPr>
@@ -4327,8 +5064,20 @@
           <w:szCs w:val="24"/>
           <w:lang w:eastAsia="ru-RU"/>
         </w:rPr>
-        <w:t>55% recall</w:t>
-      </w:r>
+        <w:t xml:space="preserve">55% </w:t>
+      </w:r>
+      <w:proofErr w:type="spellStart"/>
+      <w:r>
+        <w:rPr>
+          <w:rFonts w:eastAsia="Times New Roman" w:cs="Times New Roman"/>
+          <w:b/>
+          <w:bCs/>
+          <w:szCs w:val="24"/>
+          <w:lang w:eastAsia="ru-RU"/>
+        </w:rPr>
+        <w:t>recall</w:t>
+      </w:r>
+      <w:proofErr w:type="spellEnd"/>
       <w:r>
         <w:rPr>
           <w:rFonts w:eastAsia="Times New Roman" w:cs="Times New Roman"/>
@@ -4382,6 +5131,7 @@
         </w:rPr>
         <w:t>3. Итоговый ответ (</w:t>
       </w:r>
+      <w:proofErr w:type="spellStart"/>
       <w:r>
         <w:rPr>
           <w:rFonts w:ascii="Consolas" w:eastAsia="Times New Roman" w:hAnsi="Consolas" w:cs="Times New Roman"/>
@@ -4393,6 +5143,7 @@
         </w:rPr>
         <w:t>accuracy</w:t>
       </w:r>
+      <w:proofErr w:type="spellEnd"/>
       <w:r>
         <w:rPr>
           <w:rFonts w:eastAsia="Times New Roman" w:cs="Times New Roman"/>
@@ -4702,6 +5453,7 @@
                 <w:lang w:eastAsia="ru-RU"/>
               </w:rPr>
             </w:pPr>
+            <w:proofErr w:type="spellStart"/>
             <w:r>
               <w:rPr>
                 <w:rFonts w:eastAsia="Times New Roman" w:cs="Times New Roman"/>
@@ -4712,6 +5464,7 @@
               </w:rPr>
               <w:t>Accuracy</w:t>
             </w:r>
+            <w:proofErr w:type="spellEnd"/>
           </w:p>
         </w:tc>
       </w:tr>
@@ -5436,15 +6189,81 @@
           <w:szCs w:val="24"/>
           <w:lang w:eastAsia="ru-RU"/>
         </w:rPr>
-        <w:t xml:space="preserve"> слишком далеко» — засчитано как корректное поведение (агент правильно распознал задачу, ограничение модели).</w:t>
-      </w:r>
-      <w:r>
-        <w:rPr>
-          <w:rFonts w:eastAsia="Times New Roman" w:cs="Times New Roman"/>
-          <w:szCs w:val="24"/>
-          <w:lang w:eastAsia="ru-RU"/>
-        </w:rPr>
-        <w:t>&lt;details&gt;&lt;summary&gt;Детализация ошибок по категориям&lt;/summary&gt;</w:t>
+        <w:t xml:space="preserve"> слишком далеко» — засчитано как корректное поведение (агент правильно распознал задачу, ограничение модели</w:t>
+      </w:r>
+      <w:proofErr w:type="gramStart"/>
+      <w:r>
+        <w:rPr>
+          <w:rFonts w:eastAsia="Times New Roman" w:cs="Times New Roman"/>
+          <w:i/>
+          <w:iCs/>
+          <w:szCs w:val="24"/>
+          <w:lang w:eastAsia="ru-RU"/>
+        </w:rPr>
+        <w:t>).</w:t>
+      </w:r>
+      <w:r>
+        <w:rPr>
+          <w:rFonts w:eastAsia="Times New Roman" w:cs="Times New Roman"/>
+          <w:szCs w:val="24"/>
+          <w:lang w:eastAsia="ru-RU"/>
+        </w:rPr>
+        <w:t>&lt;</w:t>
+      </w:r>
+      <w:proofErr w:type="spellStart"/>
+      <w:proofErr w:type="gramEnd"/>
+      <w:r>
+        <w:rPr>
+          <w:rFonts w:eastAsia="Times New Roman" w:cs="Times New Roman"/>
+          <w:szCs w:val="24"/>
+          <w:lang w:eastAsia="ru-RU"/>
+        </w:rPr>
+        <w:t>details</w:t>
+      </w:r>
+      <w:proofErr w:type="spellEnd"/>
+      <w:r>
+        <w:rPr>
+          <w:rFonts w:eastAsia="Times New Roman" w:cs="Times New Roman"/>
+          <w:szCs w:val="24"/>
+          <w:lang w:eastAsia="ru-RU"/>
+        </w:rPr>
+        <w:t>&gt;&lt;</w:t>
+      </w:r>
+      <w:proofErr w:type="spellStart"/>
+      <w:r>
+        <w:rPr>
+          <w:rFonts w:eastAsia="Times New Roman" w:cs="Times New Roman"/>
+          <w:szCs w:val="24"/>
+          <w:lang w:eastAsia="ru-RU"/>
+        </w:rPr>
+        <w:t>summary</w:t>
+      </w:r>
+      <w:proofErr w:type="spellEnd"/>
+      <w:r>
+        <w:rPr>
+          <w:rFonts w:eastAsia="Times New Roman" w:cs="Times New Roman"/>
+          <w:szCs w:val="24"/>
+          <w:lang w:eastAsia="ru-RU"/>
+        </w:rPr>
+        <w:t>&gt;Детализация ошибок по категориям&lt;/</w:t>
+      </w:r>
+      <w:proofErr w:type="spellStart"/>
+      <w:r>
+        <w:rPr>
+          <w:rFonts w:eastAsia="Times New Roman" w:cs="Times New Roman"/>
+          <w:szCs w:val="24"/>
+          <w:lang w:eastAsia="ru-RU"/>
+        </w:rPr>
+        <w:t>summary</w:t>
+      </w:r>
+      <w:proofErr w:type="spellEnd"/>
+      <w:r>
+        <w:rPr>
+          <w:rFonts w:eastAsia="Times New Roman" w:cs="Times New Roman"/>
+          <w:szCs w:val="24"/>
+          <w:lang w:eastAsia="ru-RU"/>
+        </w:rPr>
+        <w:t>&gt;</w:t>
       </w:r>
       <w:r>
         <w:rPr>
@@ -5500,23 +6319,88 @@
           <w:szCs w:val="24"/>
           <w:lang w:eastAsia="ru-RU"/>
         </w:rPr>
+        <w:lastRenderedPageBreak/>
         <w:t>Q31, Q34, Q37, Q38, Q40 → ERROR </w:t>
       </w:r>
+      <w:proofErr w:type="spellStart"/>
       <w:r>
         <w:rPr>
           <w:rFonts w:ascii="Consolas" w:eastAsia="Times New Roman" w:hAnsi="Consolas" w:cs="Times New Roman"/>
           <w:sz w:val="22"/>
           <w:lang w:eastAsia="ru-RU"/>
         </w:rPr>
-        <w:t>unhashable type: 'list'</w:t>
-      </w:r>
-      <w:r>
-        <w:rPr>
-          <w:rFonts w:eastAsia="Times New Roman" w:cs="Times New Roman"/>
-          <w:szCs w:val="24"/>
-          <w:lang w:eastAsia="ru-RU"/>
-        </w:rPr>
-        <w:t> (баг — pipeline не поддерживает список серий)</w:t>
+        <w:t>unhashable</w:t>
+      </w:r>
+      <w:proofErr w:type="spellEnd"/>
+      <w:r>
+        <w:rPr>
+          <w:rFonts w:ascii="Consolas" w:eastAsia="Times New Roman" w:hAnsi="Consolas" w:cs="Times New Roman"/>
+          <w:sz w:val="22"/>
+          <w:lang w:eastAsia="ru-RU"/>
+        </w:rPr>
+        <w:t xml:space="preserve"> </w:t>
+      </w:r>
+      <w:proofErr w:type="spellStart"/>
+      <w:r>
+        <w:rPr>
+          <w:rFonts w:ascii="Consolas" w:eastAsia="Times New Roman" w:hAnsi="Consolas" w:cs="Times New Roman"/>
+          <w:sz w:val="22"/>
+          <w:lang w:eastAsia="ru-RU"/>
+        </w:rPr>
+        <w:t>type</w:t>
+      </w:r>
+      <w:proofErr w:type="spellEnd"/>
+      <w:r>
+        <w:rPr>
+          <w:rFonts w:ascii="Consolas" w:eastAsia="Times New Roman" w:hAnsi="Consolas" w:cs="Times New Roman"/>
+          <w:sz w:val="22"/>
+          <w:lang w:eastAsia="ru-RU"/>
+        </w:rPr>
+        <w:t>: '</w:t>
+      </w:r>
+      <w:proofErr w:type="spellStart"/>
+      <w:r>
+        <w:rPr>
+          <w:rFonts w:ascii="Consolas" w:eastAsia="Times New Roman" w:hAnsi="Consolas" w:cs="Times New Roman"/>
+          <w:sz w:val="22"/>
+          <w:lang w:eastAsia="ru-RU"/>
+        </w:rPr>
+        <w:t>list</w:t>
+      </w:r>
+      <w:proofErr w:type="spellEnd"/>
+      <w:r>
+        <w:rPr>
+          <w:rFonts w:ascii="Consolas" w:eastAsia="Times New Roman" w:hAnsi="Consolas" w:cs="Times New Roman"/>
+          <w:sz w:val="22"/>
+          <w:lang w:eastAsia="ru-RU"/>
+        </w:rPr>
+        <w:t>'</w:t>
+      </w:r>
+      <w:r>
+        <w:rPr>
+          <w:rFonts w:eastAsia="Times New Roman" w:cs="Times New Roman"/>
+          <w:szCs w:val="24"/>
+          <w:lang w:eastAsia="ru-RU"/>
+        </w:rPr>
+        <w:t xml:space="preserve"> (баг — </w:t>
+      </w:r>
+      <w:proofErr w:type="spellStart"/>
+      <w:r>
+        <w:rPr>
+          <w:rFonts w:eastAsia="Times New Roman" w:cs="Times New Roman"/>
+          <w:szCs w:val="24"/>
+          <w:lang w:eastAsia="ru-RU"/>
+        </w:rPr>
+        <w:t>pipeline</w:t>
+      </w:r>
+      <w:proofErr w:type="spellEnd"/>
+      <w:r>
+        <w:rPr>
+          <w:rFonts w:eastAsia="Times New Roman" w:cs="Times New Roman"/>
+          <w:szCs w:val="24"/>
+          <w:lang w:eastAsia="ru-RU"/>
+        </w:rPr>
+        <w:t xml:space="preserve"> не поддерживает список серий)</w:t>
       </w:r>
     </w:p>
     <w:p>
@@ -5539,7 +6423,43 @@
           <w:szCs w:val="24"/>
           <w:lang w:eastAsia="ru-RU"/>
         </w:rPr>
-        <w:t>Q32, Q35, Q36, Q39 → «Неизвестный тип: sales, trips» (та же проблема — мульти-серии)</w:t>
+        <w:t xml:space="preserve">Q32, Q35, Q36, Q39 → «Неизвестный тип: </w:t>
+      </w:r>
+      <w:proofErr w:type="spellStart"/>
+      <w:r>
+        <w:rPr>
+          <w:rFonts w:eastAsia="Times New Roman" w:cs="Times New Roman"/>
+          <w:szCs w:val="24"/>
+          <w:lang w:eastAsia="ru-RU"/>
+        </w:rPr>
+        <w:t>sales</w:t>
+      </w:r>
+      <w:proofErr w:type="spellEnd"/>
+      <w:r>
+        <w:rPr>
+          <w:rFonts w:eastAsia="Times New Roman" w:cs="Times New Roman"/>
+          <w:szCs w:val="24"/>
+          <w:lang w:eastAsia="ru-RU"/>
+        </w:rPr>
+        <w:t xml:space="preserve">, </w:t>
+      </w:r>
+      <w:proofErr w:type="spellStart"/>
+      <w:r>
+        <w:rPr>
+          <w:rFonts w:eastAsia="Times New Roman" w:cs="Times New Roman"/>
+          <w:szCs w:val="24"/>
+          <w:lang w:eastAsia="ru-RU"/>
+        </w:rPr>
+        <w:t>trips</w:t>
+      </w:r>
+      <w:proofErr w:type="spellEnd"/>
+      <w:r>
+        <w:rPr>
+          <w:rFonts w:eastAsia="Times New Roman" w:cs="Times New Roman"/>
+          <w:szCs w:val="24"/>
+          <w:lang w:eastAsia="ru-RU"/>
+        </w:rPr>
+        <w:t>» (та же проблема — мульти-серии)</w:t>
       </w:r>
     </w:p>
     <w:p>
@@ -5602,7 +6522,6 @@
           <w:szCs w:val="24"/>
           <w:lang w:eastAsia="ru-RU"/>
         </w:rPr>
-        <w:lastRenderedPageBreak/>
         <w:t>Q51–Q58 (ожидание: отказ):</w:t>
       </w:r>
     </w:p>
@@ -5644,7 +6563,25 @@
           <w:szCs w:val="24"/>
           <w:lang w:eastAsia="ru-RU"/>
         </w:rPr>
-        <w:t>&lt;/details&gt;</w:t>
+        <w:t>&lt;/</w:t>
+      </w:r>
+      <w:proofErr w:type="spellStart"/>
+      <w:r>
+        <w:rPr>
+          <w:rFonts w:eastAsia="Times New Roman" w:cs="Times New Roman"/>
+          <w:szCs w:val="24"/>
+          <w:lang w:eastAsia="ru-RU"/>
+        </w:rPr>
+        <w:t>details</w:t>
+      </w:r>
+      <w:proofErr w:type="spellEnd"/>
+      <w:r>
+        <w:rPr>
+          <w:rFonts w:eastAsia="Times New Roman" w:cs="Times New Roman"/>
+          <w:szCs w:val="24"/>
+          <w:lang w:eastAsia="ru-RU"/>
+        </w:rPr>
+        <w:t>&gt;</w:t>
       </w:r>
     </w:p>
     <w:p>
@@ -5855,8 +6792,20 @@
                 <w:szCs w:val="24"/>
                 <w:lang w:eastAsia="ru-RU"/>
               </w:rPr>
-              <w:t>Task Type Recall</w:t>
-            </w:r>
+              <w:t xml:space="preserve">Task Type </w:t>
+            </w:r>
+            <w:proofErr w:type="spellStart"/>
+            <w:r>
+              <w:rPr>
+                <w:rFonts w:eastAsia="Times New Roman" w:cs="Times New Roman"/>
+                <w:b/>
+                <w:bCs/>
+                <w:szCs w:val="24"/>
+                <w:lang w:eastAsia="ru-RU"/>
+              </w:rPr>
+              <w:t>Recall</w:t>
+            </w:r>
+            <w:proofErr w:type="spellEnd"/>
           </w:p>
         </w:tc>
         <w:tc>
@@ -5966,8 +6915,20 @@
                 <w:szCs w:val="24"/>
                 <w:lang w:eastAsia="ru-RU"/>
               </w:rPr>
-              <w:t>Task Type Specificity</w:t>
-            </w:r>
+              <w:t xml:space="preserve">Task Type </w:t>
+            </w:r>
+            <w:proofErr w:type="spellStart"/>
+            <w:r>
+              <w:rPr>
+                <w:rFonts w:eastAsia="Times New Roman" w:cs="Times New Roman"/>
+                <w:b/>
+                <w:bCs/>
+                <w:szCs w:val="24"/>
+                <w:lang w:eastAsia="ru-RU"/>
+              </w:rPr>
+              <w:t>Specificity</w:t>
+            </w:r>
+            <w:proofErr w:type="spellEnd"/>
           </w:p>
         </w:tc>
         <w:tc>
@@ -6041,8 +7002,18 @@
                 <w:szCs w:val="24"/>
                 <w:lang w:eastAsia="ru-RU"/>
               </w:rPr>
-              <w:t xml:space="preserve"> Нужна доработка промпта</w:t>
-            </w:r>
+              <w:t xml:space="preserve"> Нужна доработка </w:t>
+            </w:r>
+            <w:proofErr w:type="spellStart"/>
+            <w:r>
+              <w:rPr>
+                <w:rFonts w:eastAsia="Times New Roman" w:cs="Times New Roman"/>
+                <w:szCs w:val="24"/>
+                <w:lang w:eastAsia="ru-RU"/>
+              </w:rPr>
+              <w:t>промпта</w:t>
+            </w:r>
+            <w:proofErr w:type="spellEnd"/>
           </w:p>
         </w:tc>
       </w:tr>
@@ -6069,6 +7040,7 @@
                 <w:lang w:eastAsia="ru-RU"/>
               </w:rPr>
             </w:pPr>
+            <w:proofErr w:type="spellStart"/>
             <w:r>
               <w:rPr>
                 <w:rFonts w:eastAsia="Times New Roman" w:cs="Times New Roman"/>
@@ -6077,8 +7049,31 @@
                 <w:szCs w:val="24"/>
                 <w:lang w:eastAsia="ru-RU"/>
               </w:rPr>
-              <w:t>Date Recall</w:t>
-            </w:r>
+              <w:t>Date</w:t>
+            </w:r>
+            <w:proofErr w:type="spellEnd"/>
+            <w:r>
+              <w:rPr>
+                <w:rFonts w:eastAsia="Times New Roman" w:cs="Times New Roman"/>
+                <w:b/>
+                <w:bCs/>
+                <w:szCs w:val="24"/>
+                <w:lang w:eastAsia="ru-RU"/>
+              </w:rPr>
+              <w:t xml:space="preserve"> </w:t>
+            </w:r>
+            <w:proofErr w:type="spellStart"/>
+            <w:r>
+              <w:rPr>
+                <w:rFonts w:eastAsia="Times New Roman" w:cs="Times New Roman"/>
+                <w:b/>
+                <w:bCs/>
+                <w:szCs w:val="24"/>
+                <w:lang w:eastAsia="ru-RU"/>
+              </w:rPr>
+              <w:t>Recall</w:t>
+            </w:r>
+            <w:proofErr w:type="spellEnd"/>
           </w:p>
         </w:tc>
         <w:tc>
@@ -6180,6 +7175,7 @@
                 <w:lang w:eastAsia="ru-RU"/>
               </w:rPr>
             </w:pPr>
+            <w:proofErr w:type="spellStart"/>
             <w:r>
               <w:rPr>
                 <w:rFonts w:eastAsia="Times New Roman" w:cs="Times New Roman"/>
@@ -6188,8 +7184,31 @@
                 <w:szCs w:val="24"/>
                 <w:lang w:eastAsia="ru-RU"/>
               </w:rPr>
-              <w:t>Date Specificity</w:t>
-            </w:r>
+              <w:t>Date</w:t>
+            </w:r>
+            <w:proofErr w:type="spellEnd"/>
+            <w:r>
+              <w:rPr>
+                <w:rFonts w:eastAsia="Times New Roman" w:cs="Times New Roman"/>
+                <w:b/>
+                <w:bCs/>
+                <w:szCs w:val="24"/>
+                <w:lang w:eastAsia="ru-RU"/>
+              </w:rPr>
+              <w:t xml:space="preserve"> </w:t>
+            </w:r>
+            <w:proofErr w:type="spellStart"/>
+            <w:r>
+              <w:rPr>
+                <w:rFonts w:eastAsia="Times New Roman" w:cs="Times New Roman"/>
+                <w:b/>
+                <w:bCs/>
+                <w:szCs w:val="24"/>
+                <w:lang w:eastAsia="ru-RU"/>
+              </w:rPr>
+              <w:t>Specificity</w:t>
+            </w:r>
+            <w:proofErr w:type="spellEnd"/>
           </w:p>
         </w:tc>
         <w:tc>
@@ -6294,6 +7313,7 @@
                 <w:lang w:eastAsia="ru-RU"/>
               </w:rPr>
             </w:pPr>
+            <w:proofErr w:type="spellStart"/>
             <w:r>
               <w:rPr>
                 <w:rFonts w:eastAsia="Times New Roman" w:cs="Times New Roman"/>
@@ -6302,8 +7322,31 @@
                 <w:szCs w:val="24"/>
                 <w:lang w:eastAsia="ru-RU"/>
               </w:rPr>
-              <w:t>Answer Accuracy</w:t>
-            </w:r>
+              <w:t>Answer</w:t>
+            </w:r>
+            <w:proofErr w:type="spellEnd"/>
+            <w:r>
+              <w:rPr>
+                <w:rFonts w:eastAsia="Times New Roman" w:cs="Times New Roman"/>
+                <w:b/>
+                <w:bCs/>
+                <w:szCs w:val="24"/>
+                <w:lang w:eastAsia="ru-RU"/>
+              </w:rPr>
+              <w:t xml:space="preserve"> </w:t>
+            </w:r>
+            <w:proofErr w:type="spellStart"/>
+            <w:r>
+              <w:rPr>
+                <w:rFonts w:eastAsia="Times New Roman" w:cs="Times New Roman"/>
+                <w:b/>
+                <w:bCs/>
+                <w:szCs w:val="24"/>
+                <w:lang w:eastAsia="ru-RU"/>
+              </w:rPr>
+              <w:t>Accuracy</w:t>
+            </w:r>
+            <w:proofErr w:type="spellEnd"/>
           </w:p>
         </w:tc>
         <w:tc>
@@ -6442,8 +7485,27 @@
           <w:szCs w:val="24"/>
           <w:lang w:eastAsia="ru-RU"/>
         </w:rPr>
-        <w:t> Pipeline не поддерживает </w:t>
-      </w:r>
+        <w:t> </w:t>
+      </w:r>
+      <w:proofErr w:type="spellStart"/>
+      <w:r>
+        <w:rPr>
+          <w:rFonts w:eastAsia="Times New Roman" w:cs="Times New Roman"/>
+          <w:szCs w:val="24"/>
+          <w:lang w:eastAsia="ru-RU"/>
+        </w:rPr>
+        <w:t>Pipeline</w:t>
+      </w:r>
+      <w:proofErr w:type="spellEnd"/>
+      <w:r>
+        <w:rPr>
+          <w:rFonts w:eastAsia="Times New Roman" w:cs="Times New Roman"/>
+          <w:szCs w:val="24"/>
+          <w:lang w:eastAsia="ru-RU"/>
+        </w:rPr>
+        <w:t> не поддерживает </w:t>
+      </w:r>
+      <w:proofErr w:type="spellStart"/>
       <w:r>
         <w:rPr>
           <w:rFonts w:ascii="Consolas" w:eastAsia="Times New Roman" w:hAnsi="Consolas" w:cs="Times New Roman"/>
@@ -6452,6 +7514,7 @@
         </w:rPr>
         <w:t>series</w:t>
       </w:r>
+      <w:proofErr w:type="spellEnd"/>
       <w:r>
         <w:rPr>
           <w:rFonts w:eastAsia="Times New Roman" w:cs="Times New Roman"/>
@@ -6507,7 +7570,25 @@
           <w:szCs w:val="24"/>
           <w:lang w:eastAsia="ru-RU"/>
         </w:rPr>
-        <w:t> не учитывает контекст — цепляется за слова «цена», «продажи», «поездку». Нужно добавить примеры ловушек в промпт.</w:t>
+        <w:t xml:space="preserve"> не учитывает контекст — цепляется за слова «цена», «продажи», «поездку». Нужно добавить примеры ловушек в </w:t>
+      </w:r>
+      <w:proofErr w:type="spellStart"/>
+      <w:r>
+        <w:rPr>
+          <w:rFonts w:eastAsia="Times New Roman" w:cs="Times New Roman"/>
+          <w:szCs w:val="24"/>
+          <w:lang w:eastAsia="ru-RU"/>
+        </w:rPr>
+        <w:t>промпт</w:t>
+      </w:r>
+      <w:proofErr w:type="spellEnd"/>
+      <w:r>
+        <w:rPr>
+          <w:rFonts w:eastAsia="Times New Roman" w:cs="Times New Roman"/>
+          <w:szCs w:val="24"/>
+          <w:lang w:eastAsia="ru-RU"/>
+        </w:rPr>
+        <w:t>.</w:t>
       </w:r>
     </w:p>
     <w:p>
@@ -6532,15 +7613,35 @@
           <w:szCs w:val="24"/>
           <w:lang w:eastAsia="ru-RU"/>
         </w:rPr>
-        <w:t>Относительные даты (18 из 40 ошибок):</w:t>
-      </w:r>
-      <w:r>
-        <w:rPr>
-          <w:rFonts w:eastAsia="Times New Roman" w:cs="Times New Roman"/>
-          <w:szCs w:val="24"/>
-          <w:lang w:eastAsia="ru-RU"/>
-        </w:rPr>
-        <w:t> Нужно уточнить </w:t>
+        <w:t>Относительные даты (18 из 40 ошибок)</w:t>
+      </w:r>
+      <w:proofErr w:type="gramStart"/>
+      <w:r>
+        <w:rPr>
+          <w:rFonts w:eastAsia="Times New Roman" w:cs="Times New Roman"/>
+          <w:b/>
+          <w:bCs/>
+          <w:szCs w:val="24"/>
+          <w:lang w:eastAsia="ru-RU"/>
+        </w:rPr>
+        <w:t>:</w:t>
+      </w:r>
+      <w:r>
+        <w:rPr>
+          <w:rFonts w:eastAsia="Times New Roman" w:cs="Times New Roman"/>
+          <w:szCs w:val="24"/>
+          <w:lang w:eastAsia="ru-RU"/>
+        </w:rPr>
+        <w:t> Нужно</w:t>
+      </w:r>
+      <w:proofErr w:type="gramEnd"/>
+      <w:r>
+        <w:rPr>
+          <w:rFonts w:eastAsia="Times New Roman" w:cs="Times New Roman"/>
+          <w:szCs w:val="24"/>
+          <w:lang w:eastAsia="ru-RU"/>
+        </w:rPr>
+        <w:t xml:space="preserve"> уточнить </w:t>
       </w:r>
       <w:r>
         <w:rPr>
@@ -6556,7 +7657,43 @@
           <w:szCs w:val="24"/>
           <w:lang w:eastAsia="ru-RU"/>
         </w:rPr>
-        <w:t> — явно определить, что «следующая неделя» = Пн–Вс </w:t>
+        <w:t xml:space="preserve"> — явно определить, что «следующая неделя» = </w:t>
+      </w:r>
+      <w:proofErr w:type="spellStart"/>
+      <w:r>
+        <w:rPr>
+          <w:rFonts w:eastAsia="Times New Roman" w:cs="Times New Roman"/>
+          <w:szCs w:val="24"/>
+          <w:lang w:eastAsia="ru-RU"/>
+        </w:rPr>
+        <w:t>Пн</w:t>
+      </w:r>
+      <w:proofErr w:type="spellEnd"/>
+      <w:r>
+        <w:rPr>
+          <w:rFonts w:eastAsia="Times New Roman" w:cs="Times New Roman"/>
+          <w:szCs w:val="24"/>
+          <w:lang w:eastAsia="ru-RU"/>
+        </w:rPr>
+        <w:t>–</w:t>
+      </w:r>
+      <w:proofErr w:type="spellStart"/>
+      <w:r>
+        <w:rPr>
+          <w:rFonts w:eastAsia="Times New Roman" w:cs="Times New Roman"/>
+          <w:szCs w:val="24"/>
+          <w:lang w:eastAsia="ru-RU"/>
+        </w:rPr>
+        <w:t>Вс</w:t>
+      </w:r>
+      <w:proofErr w:type="spellEnd"/>
+      <w:r>
+        <w:rPr>
+          <w:rFonts w:eastAsia="Times New Roman" w:cs="Times New Roman"/>
+          <w:szCs w:val="24"/>
+          <w:lang w:eastAsia="ru-RU"/>
+        </w:rPr>
+        <w:t> </w:t>
       </w:r>
       <w:r>
         <w:rPr>

</xml_diff>